<commit_message>
Implement M0011 V1 release readiness
</commit_message>
<xml_diff>
--- a/artifacts/review/evidence/M0010/libreoffice-origin-word.docx
+++ b/artifacts/review/evidence/M0010/libreoffice-origin-word.docx
@@ -249,7 +249,7 @@
         <mc:AlternateContent>
           <mc:Choice Requires="wps">
             <w:drawing>
-              <wp:anchor distT="72390" distB="72390" distL="72390" distR="72390" simplePos="0" relativeHeight="2" behindDoc="0" locked="0" layoutInCell="0" allowOverlap="1" wp14:anchorId="672FB198" wp14:editId="2BBCFED8">
+              <wp:anchor distT="72390" distB="72390" distL="72390" distR="72390" simplePos="0" relativeHeight="2" behindDoc="0" locked="0" layoutInCell="0" allowOverlap="1" wp14:anchorId="5D3604B0" wp14:editId="7C5EACE0">
                 <wp:simplePos x="0" y="0"/>
                 <wp:positionH relativeFrom="column">
                   <wp:align>center</wp:align>
@@ -362,13 +362,13 @@
 
 <file path=word/commentsExtended.xml><?xml version="1.0" encoding="utf-8"?>
 <w15:commentsEx xmlns:wpc="http://schemas.microsoft.com/office/word/2010/wordprocessingCanvas" xmlns:cx="http://schemas.microsoft.com/office/drawing/2014/chartex" xmlns:cx1="http://schemas.microsoft.com/office/drawing/2015/9/8/chartex" xmlns:cx2="http://schemas.microsoft.com/office/drawing/2015/10/21/chartex" xmlns:cx3="http://schemas.microsoft.com/office/drawing/2016/5/9/chartex" xmlns:cx4="http://schemas.microsoft.com/office/drawing/2016/5/10/chartex" xmlns:cx5="http://schemas.microsoft.com/office/drawing/2016/5/11/chartex" xmlns:cx6="http://schemas.microsoft.com/office/drawing/2016/5/12/chartex" xmlns:cx7="http://schemas.microsoft.com/office/drawing/2016/5/13/chartex" xmlns:cx8="http://schemas.microsoft.com/office/drawing/2016/5/14/chartex" xmlns:mc="http://schemas.openxmlformats.org/markup-compatibility/2006" xmlns:aink="http://schemas.microsoft.com/office/drawing/2016/ink" xmlns:am3d="http://schemas.microsoft.com/office/drawing/2017/model3d" xmlns:o="urn:schemas-microsoft-com:office:office" xmlns:oel="http://schemas.microsoft.com/office/2019/extlst" xmlns:r="http://schemas.openxmlformats.org/officeDocument/2006/relationships" xmlns:m="http://schemas.openxmlformats.org/officeDocument/2006/math" xmlns:v="urn:schemas-microsoft-com:vml" xmlns:wp14="http://schemas.microsoft.com/office/word/2010/wordprocessingDrawing" xmlns:wp="http://schemas.openxmlformats.org/drawingml/2006/wordprocessingDrawing" xmlns:w10="urn:schemas-microsoft-com:office:word" xmlns:w="http://schemas.openxmlformats.org/wordprocessingml/2006/main" xmlns:w14="http://schemas.microsoft.com/office/word/2010/wordml" xmlns:w15="http://schemas.microsoft.com/office/word/2012/wordml" xmlns:w16cex="http://schemas.microsoft.com/office/word/2018/wordml/cex" xmlns:w16cid="http://schemas.microsoft.com/office/word/2016/wordml/cid" xmlns:w16="http://schemas.microsoft.com/office/word/2018/wordml" xmlns:w16du="http://schemas.microsoft.com/office/word/2023/wordml/word16du" xmlns:w16sdtdh="http://schemas.microsoft.com/office/word/2020/wordml/sdtdatahash" xmlns:w16sdtfl="http://schemas.microsoft.com/office/word/2024/wordml/sdtformatlock" xmlns:w16se="http://schemas.microsoft.com/office/word/2015/wordml/symex" xmlns:wpg="http://schemas.microsoft.com/office/word/2010/wordprocessingGroup" xmlns:wpi="http://schemas.microsoft.com/office/word/2010/wordprocessingInk" xmlns:wne="http://schemas.microsoft.com/office/word/2006/wordml" xmlns:wps="http://schemas.microsoft.com/office/word/2010/wordprocessingShape" mc:Ignorable="w14 w15 w16se w16cid w16 w16cex w16sdtdh w16sdtfl w16du wp14">
-  <w15:commentEx w15:paraId="0C896A28" w15:done="0"/>
+  <w15:commentEx w15:paraId="571AFE84" w15:done="0"/>
 </w15:commentsEx>
 </file>
 
 <file path=word/commentsIds.xml><?xml version="1.0" encoding="utf-8"?>
 <w16cid:commentsIds xmlns:wpc="http://schemas.microsoft.com/office/word/2010/wordprocessingCanvas" xmlns:cx="http://schemas.microsoft.com/office/drawing/2014/chartex" xmlns:cx1="http://schemas.microsoft.com/office/drawing/2015/9/8/chartex" xmlns:cx2="http://schemas.microsoft.com/office/drawing/2015/10/21/chartex" xmlns:cx3="http://schemas.microsoft.com/office/drawing/2016/5/9/chartex" xmlns:cx4="http://schemas.microsoft.com/office/drawing/2016/5/10/chartex" xmlns:cx5="http://schemas.microsoft.com/office/drawing/2016/5/11/chartex" xmlns:cx6="http://schemas.microsoft.com/office/drawing/2016/5/12/chartex" xmlns:cx7="http://schemas.microsoft.com/office/drawing/2016/5/13/chartex" xmlns:cx8="http://schemas.microsoft.com/office/drawing/2016/5/14/chartex" xmlns:mc="http://schemas.openxmlformats.org/markup-compatibility/2006" xmlns:aink="http://schemas.microsoft.com/office/drawing/2016/ink" xmlns:am3d="http://schemas.microsoft.com/office/drawing/2017/model3d" xmlns:o="urn:schemas-microsoft-com:office:office" xmlns:oel="http://schemas.microsoft.com/office/2019/extlst" xmlns:r="http://schemas.openxmlformats.org/officeDocument/2006/relationships" xmlns:m="http://schemas.openxmlformats.org/officeDocument/2006/math" xmlns:v="urn:schemas-microsoft-com:vml" xmlns:wp14="http://schemas.microsoft.com/office/word/2010/wordprocessingDrawing" xmlns:wp="http://schemas.openxmlformats.org/drawingml/2006/wordprocessingDrawing" xmlns:w10="urn:schemas-microsoft-com:office:word" xmlns:w="http://schemas.openxmlformats.org/wordprocessingml/2006/main" xmlns:w14="http://schemas.microsoft.com/office/word/2010/wordml" xmlns:w15="http://schemas.microsoft.com/office/word/2012/wordml" xmlns:w16cex="http://schemas.microsoft.com/office/word/2018/wordml/cex" xmlns:w16cid="http://schemas.microsoft.com/office/word/2016/wordml/cid" xmlns:w16="http://schemas.microsoft.com/office/word/2018/wordml" xmlns:w16du="http://schemas.microsoft.com/office/word/2023/wordml/word16du" xmlns:w16sdtdh="http://schemas.microsoft.com/office/word/2020/wordml/sdtdatahash" xmlns:w16sdtfl="http://schemas.microsoft.com/office/word/2024/wordml/sdtformatlock" xmlns:w16se="http://schemas.microsoft.com/office/word/2015/wordml/symex" xmlns:wpg="http://schemas.microsoft.com/office/word/2010/wordprocessingGroup" xmlns:wpi="http://schemas.microsoft.com/office/word/2010/wordprocessingInk" xmlns:wne="http://schemas.microsoft.com/office/word/2006/wordml" xmlns:wps="http://schemas.microsoft.com/office/word/2010/wordprocessingShape" mc:Ignorable="w14 w15 w16se w16cid w16 w16cex w16sdtdh w16sdtfl w16du wp14">
-  <w16cid:commentId w16cid:paraId="0C896A28" w16cid:durableId="3E97E34F"/>
+  <w16cid:commentId w16cid:paraId="571AFE84" w16cid:durableId="30C2AB45"/>
 </w16cid:commentsIds>
 </file>
 

</xml_diff>

<commit_message>
Correct M0011 Word binding and release validation
</commit_message>
<xml_diff>
--- a/artifacts/review/evidence/M0010/libreoffice-origin-word.docx
+++ b/artifacts/review/evidence/M0010/libreoffice-origin-word.docx
@@ -134,7 +134,7 @@
           <w:bottom w:w="55" w:type="dxa"/>
           <w:right w:w="55" w:type="dxa"/>
         </w:tblCellMar>
-        <w:tblLook w:val="04A0" w:firstRow="1" w:lastRow="0" w:firstColumn="1" w:lastColumn="0" w:noHBand="0" w:noVBand="1"/>
+        <w:tblLook w:val="0000" w:firstRow="0" w:lastRow="0" w:firstColumn="0" w:lastColumn="0" w:noHBand="0" w:noVBand="0"/>
       </w:tblPr>
       <w:tblGrid>
         <w:gridCol w:w="4814"/>
@@ -249,7 +249,7 @@
         <mc:AlternateContent>
           <mc:Choice Requires="wps">
             <w:drawing>
-              <wp:anchor distT="72390" distB="72390" distL="72390" distR="72390" simplePos="0" relativeHeight="2" behindDoc="0" locked="0" layoutInCell="0" allowOverlap="1" wp14:anchorId="5D3604B0" wp14:editId="7C5EACE0">
+              <wp:anchor distT="72390" distB="72390" distL="72390" distR="72390" simplePos="0" relativeHeight="2" behindDoc="0" locked="0" layoutInCell="0" allowOverlap="1" wp14:anchorId="0FE903FE" wp14:editId="794AF25A">
                 <wp:simplePos x="0" y="0"/>
                 <wp:positionH relativeFrom="column">
                   <wp:align>center</wp:align>
@@ -362,13 +362,13 @@
 
 <file path=word/commentsExtended.xml><?xml version="1.0" encoding="utf-8"?>
 <w15:commentsEx xmlns:wpc="http://schemas.microsoft.com/office/word/2010/wordprocessingCanvas" xmlns:cx="http://schemas.microsoft.com/office/drawing/2014/chartex" xmlns:cx1="http://schemas.microsoft.com/office/drawing/2015/9/8/chartex" xmlns:cx2="http://schemas.microsoft.com/office/drawing/2015/10/21/chartex" xmlns:cx3="http://schemas.microsoft.com/office/drawing/2016/5/9/chartex" xmlns:cx4="http://schemas.microsoft.com/office/drawing/2016/5/10/chartex" xmlns:cx5="http://schemas.microsoft.com/office/drawing/2016/5/11/chartex" xmlns:cx6="http://schemas.microsoft.com/office/drawing/2016/5/12/chartex" xmlns:cx7="http://schemas.microsoft.com/office/drawing/2016/5/13/chartex" xmlns:cx8="http://schemas.microsoft.com/office/drawing/2016/5/14/chartex" xmlns:mc="http://schemas.openxmlformats.org/markup-compatibility/2006" xmlns:aink="http://schemas.microsoft.com/office/drawing/2016/ink" xmlns:am3d="http://schemas.microsoft.com/office/drawing/2017/model3d" xmlns:o="urn:schemas-microsoft-com:office:office" xmlns:oel="http://schemas.microsoft.com/office/2019/extlst" xmlns:r="http://schemas.openxmlformats.org/officeDocument/2006/relationships" xmlns:m="http://schemas.openxmlformats.org/officeDocument/2006/math" xmlns:v="urn:schemas-microsoft-com:vml" xmlns:wp14="http://schemas.microsoft.com/office/word/2010/wordprocessingDrawing" xmlns:wp="http://schemas.openxmlformats.org/drawingml/2006/wordprocessingDrawing" xmlns:w10="urn:schemas-microsoft-com:office:word" xmlns:w="http://schemas.openxmlformats.org/wordprocessingml/2006/main" xmlns:w14="http://schemas.microsoft.com/office/word/2010/wordml" xmlns:w15="http://schemas.microsoft.com/office/word/2012/wordml" xmlns:w16cex="http://schemas.microsoft.com/office/word/2018/wordml/cex" xmlns:w16cid="http://schemas.microsoft.com/office/word/2016/wordml/cid" xmlns:w16="http://schemas.microsoft.com/office/word/2018/wordml" xmlns:w16du="http://schemas.microsoft.com/office/word/2023/wordml/word16du" xmlns:w16sdtdh="http://schemas.microsoft.com/office/word/2020/wordml/sdtdatahash" xmlns:w16sdtfl="http://schemas.microsoft.com/office/word/2024/wordml/sdtformatlock" xmlns:w16se="http://schemas.microsoft.com/office/word/2015/wordml/symex" xmlns:wpg="http://schemas.microsoft.com/office/word/2010/wordprocessingGroup" xmlns:wpi="http://schemas.microsoft.com/office/word/2010/wordprocessingInk" xmlns:wne="http://schemas.microsoft.com/office/word/2006/wordml" xmlns:wps="http://schemas.microsoft.com/office/word/2010/wordprocessingShape" mc:Ignorable="w14 w15 w16se w16cid w16 w16cex w16sdtdh w16sdtfl w16du wp14">
-  <w15:commentEx w15:paraId="571AFE84" w15:done="0"/>
+  <w15:commentEx w15:paraId="4B4057B0" w15:done="0"/>
 </w15:commentsEx>
 </file>
 
 <file path=word/commentsIds.xml><?xml version="1.0" encoding="utf-8"?>
 <w16cid:commentsIds xmlns:wpc="http://schemas.microsoft.com/office/word/2010/wordprocessingCanvas" xmlns:cx="http://schemas.microsoft.com/office/drawing/2014/chartex" xmlns:cx1="http://schemas.microsoft.com/office/drawing/2015/9/8/chartex" xmlns:cx2="http://schemas.microsoft.com/office/drawing/2015/10/21/chartex" xmlns:cx3="http://schemas.microsoft.com/office/drawing/2016/5/9/chartex" xmlns:cx4="http://schemas.microsoft.com/office/drawing/2016/5/10/chartex" xmlns:cx5="http://schemas.microsoft.com/office/drawing/2016/5/11/chartex" xmlns:cx6="http://schemas.microsoft.com/office/drawing/2016/5/12/chartex" xmlns:cx7="http://schemas.microsoft.com/office/drawing/2016/5/13/chartex" xmlns:cx8="http://schemas.microsoft.com/office/drawing/2016/5/14/chartex" xmlns:mc="http://schemas.openxmlformats.org/markup-compatibility/2006" xmlns:aink="http://schemas.microsoft.com/office/drawing/2016/ink" xmlns:am3d="http://schemas.microsoft.com/office/drawing/2017/model3d" xmlns:o="urn:schemas-microsoft-com:office:office" xmlns:oel="http://schemas.microsoft.com/office/2019/extlst" xmlns:r="http://schemas.openxmlformats.org/officeDocument/2006/relationships" xmlns:m="http://schemas.openxmlformats.org/officeDocument/2006/math" xmlns:v="urn:schemas-microsoft-com:vml" xmlns:wp14="http://schemas.microsoft.com/office/word/2010/wordprocessingDrawing" xmlns:wp="http://schemas.openxmlformats.org/drawingml/2006/wordprocessingDrawing" xmlns:w10="urn:schemas-microsoft-com:office:word" xmlns:w="http://schemas.openxmlformats.org/wordprocessingml/2006/main" xmlns:w14="http://schemas.microsoft.com/office/word/2010/wordml" xmlns:w15="http://schemas.microsoft.com/office/word/2012/wordml" xmlns:w16cex="http://schemas.microsoft.com/office/word/2018/wordml/cex" xmlns:w16cid="http://schemas.microsoft.com/office/word/2016/wordml/cid" xmlns:w16="http://schemas.microsoft.com/office/word/2018/wordml" xmlns:w16du="http://schemas.microsoft.com/office/word/2023/wordml/word16du" xmlns:w16sdtdh="http://schemas.microsoft.com/office/word/2020/wordml/sdtdatahash" xmlns:w16sdtfl="http://schemas.microsoft.com/office/word/2024/wordml/sdtformatlock" xmlns:w16se="http://schemas.microsoft.com/office/word/2015/wordml/symex" xmlns:wpg="http://schemas.microsoft.com/office/word/2010/wordprocessingGroup" xmlns:wpi="http://schemas.microsoft.com/office/word/2010/wordprocessingInk" xmlns:wne="http://schemas.microsoft.com/office/word/2006/wordml" xmlns:wps="http://schemas.microsoft.com/office/word/2010/wordprocessingShape" mc:Ignorable="w14 w15 w16se w16cid w16 w16cex w16sdtdh w16sdtfl w16du wp14">
-  <w16cid:commentId w16cid:paraId="571AFE84" w16cid:durableId="30C2AB45"/>
+  <w16cid:commentId w16cid:paraId="4B4057B0" w16cid:durableId="2587178C"/>
 </w16cid:commentsIds>
 </file>
 

</xml_diff>

<commit_message>
Regenerate corrected M0011 release evidence
</commit_message>
<xml_diff>
--- a/artifacts/review/evidence/M0010/libreoffice-origin-word.docx
+++ b/artifacts/review/evidence/M0010/libreoffice-origin-word.docx
@@ -134,7 +134,7 @@
           <w:bottom w:w="55" w:type="dxa"/>
           <w:right w:w="55" w:type="dxa"/>
         </w:tblCellMar>
-        <w:tblLook w:val="0000" w:firstRow="0" w:lastRow="0" w:firstColumn="0" w:lastColumn="0" w:noHBand="0" w:noVBand="0"/>
+        <w:tblLook w:val="04A0" w:firstRow="1" w:lastRow="0" w:firstColumn="1" w:lastColumn="0" w:noHBand="0" w:noVBand="1"/>
       </w:tblPr>
       <w:tblGrid>
         <w:gridCol w:w="4814"/>
@@ -249,7 +249,7 @@
         <mc:AlternateContent>
           <mc:Choice Requires="wps">
             <w:drawing>
-              <wp:anchor distT="72390" distB="72390" distL="72390" distR="72390" simplePos="0" relativeHeight="2" behindDoc="0" locked="0" layoutInCell="0" allowOverlap="1" wp14:anchorId="0FE903FE" wp14:editId="794AF25A">
+              <wp:anchor distT="72390" distB="72390" distL="72390" distR="72390" simplePos="0" relativeHeight="2" behindDoc="0" locked="0" layoutInCell="0" allowOverlap="1" wp14:anchorId="4433BCFD" wp14:editId="0FE60EEE">
                 <wp:simplePos x="0" y="0"/>
                 <wp:positionH relativeFrom="column">
                   <wp:align>center</wp:align>
@@ -362,13 +362,13 @@
 
 <file path=word/commentsExtended.xml><?xml version="1.0" encoding="utf-8"?>
 <w15:commentsEx xmlns:wpc="http://schemas.microsoft.com/office/word/2010/wordprocessingCanvas" xmlns:cx="http://schemas.microsoft.com/office/drawing/2014/chartex" xmlns:cx1="http://schemas.microsoft.com/office/drawing/2015/9/8/chartex" xmlns:cx2="http://schemas.microsoft.com/office/drawing/2015/10/21/chartex" xmlns:cx3="http://schemas.microsoft.com/office/drawing/2016/5/9/chartex" xmlns:cx4="http://schemas.microsoft.com/office/drawing/2016/5/10/chartex" xmlns:cx5="http://schemas.microsoft.com/office/drawing/2016/5/11/chartex" xmlns:cx6="http://schemas.microsoft.com/office/drawing/2016/5/12/chartex" xmlns:cx7="http://schemas.microsoft.com/office/drawing/2016/5/13/chartex" xmlns:cx8="http://schemas.microsoft.com/office/drawing/2016/5/14/chartex" xmlns:mc="http://schemas.openxmlformats.org/markup-compatibility/2006" xmlns:aink="http://schemas.microsoft.com/office/drawing/2016/ink" xmlns:am3d="http://schemas.microsoft.com/office/drawing/2017/model3d" xmlns:o="urn:schemas-microsoft-com:office:office" xmlns:oel="http://schemas.microsoft.com/office/2019/extlst" xmlns:r="http://schemas.openxmlformats.org/officeDocument/2006/relationships" xmlns:m="http://schemas.openxmlformats.org/officeDocument/2006/math" xmlns:v="urn:schemas-microsoft-com:vml" xmlns:wp14="http://schemas.microsoft.com/office/word/2010/wordprocessingDrawing" xmlns:wp="http://schemas.openxmlformats.org/drawingml/2006/wordprocessingDrawing" xmlns:w10="urn:schemas-microsoft-com:office:word" xmlns:w="http://schemas.openxmlformats.org/wordprocessingml/2006/main" xmlns:w14="http://schemas.microsoft.com/office/word/2010/wordml" xmlns:w15="http://schemas.microsoft.com/office/word/2012/wordml" xmlns:w16cex="http://schemas.microsoft.com/office/word/2018/wordml/cex" xmlns:w16cid="http://schemas.microsoft.com/office/word/2016/wordml/cid" xmlns:w16="http://schemas.microsoft.com/office/word/2018/wordml" xmlns:w16du="http://schemas.microsoft.com/office/word/2023/wordml/word16du" xmlns:w16sdtdh="http://schemas.microsoft.com/office/word/2020/wordml/sdtdatahash" xmlns:w16sdtfl="http://schemas.microsoft.com/office/word/2024/wordml/sdtformatlock" xmlns:w16se="http://schemas.microsoft.com/office/word/2015/wordml/symex" xmlns:wpg="http://schemas.microsoft.com/office/word/2010/wordprocessingGroup" xmlns:wpi="http://schemas.microsoft.com/office/word/2010/wordprocessingInk" xmlns:wne="http://schemas.microsoft.com/office/word/2006/wordml" xmlns:wps="http://schemas.microsoft.com/office/word/2010/wordprocessingShape" mc:Ignorable="w14 w15 w16se w16cid w16 w16cex w16sdtdh w16sdtfl w16du wp14">
-  <w15:commentEx w15:paraId="4B4057B0" w15:done="0"/>
+  <w15:commentEx w15:paraId="07D76BD9" w15:done="0"/>
 </w15:commentsEx>
 </file>
 
 <file path=word/commentsIds.xml><?xml version="1.0" encoding="utf-8"?>
 <w16cid:commentsIds xmlns:wpc="http://schemas.microsoft.com/office/word/2010/wordprocessingCanvas" xmlns:cx="http://schemas.microsoft.com/office/drawing/2014/chartex" xmlns:cx1="http://schemas.microsoft.com/office/drawing/2015/9/8/chartex" xmlns:cx2="http://schemas.microsoft.com/office/drawing/2015/10/21/chartex" xmlns:cx3="http://schemas.microsoft.com/office/drawing/2016/5/9/chartex" xmlns:cx4="http://schemas.microsoft.com/office/drawing/2016/5/10/chartex" xmlns:cx5="http://schemas.microsoft.com/office/drawing/2016/5/11/chartex" xmlns:cx6="http://schemas.microsoft.com/office/drawing/2016/5/12/chartex" xmlns:cx7="http://schemas.microsoft.com/office/drawing/2016/5/13/chartex" xmlns:cx8="http://schemas.microsoft.com/office/drawing/2016/5/14/chartex" xmlns:mc="http://schemas.openxmlformats.org/markup-compatibility/2006" xmlns:aink="http://schemas.microsoft.com/office/drawing/2016/ink" xmlns:am3d="http://schemas.microsoft.com/office/drawing/2017/model3d" xmlns:o="urn:schemas-microsoft-com:office:office" xmlns:oel="http://schemas.microsoft.com/office/2019/extlst" xmlns:r="http://schemas.openxmlformats.org/officeDocument/2006/relationships" xmlns:m="http://schemas.openxmlformats.org/officeDocument/2006/math" xmlns:v="urn:schemas-microsoft-com:vml" xmlns:wp14="http://schemas.microsoft.com/office/word/2010/wordprocessingDrawing" xmlns:wp="http://schemas.openxmlformats.org/drawingml/2006/wordprocessingDrawing" xmlns:w10="urn:schemas-microsoft-com:office:word" xmlns:w="http://schemas.openxmlformats.org/wordprocessingml/2006/main" xmlns:w14="http://schemas.microsoft.com/office/word/2010/wordml" xmlns:w15="http://schemas.microsoft.com/office/word/2012/wordml" xmlns:w16cex="http://schemas.microsoft.com/office/word/2018/wordml/cex" xmlns:w16cid="http://schemas.microsoft.com/office/word/2016/wordml/cid" xmlns:w16="http://schemas.microsoft.com/office/word/2018/wordml" xmlns:w16du="http://schemas.microsoft.com/office/word/2023/wordml/word16du" xmlns:w16sdtdh="http://schemas.microsoft.com/office/word/2020/wordml/sdtdatahash" xmlns:w16sdtfl="http://schemas.microsoft.com/office/word/2024/wordml/sdtformatlock" xmlns:w16se="http://schemas.microsoft.com/office/word/2015/wordml/symex" xmlns:wpg="http://schemas.microsoft.com/office/word/2010/wordprocessingGroup" xmlns:wpi="http://schemas.microsoft.com/office/word/2010/wordprocessingInk" xmlns:wne="http://schemas.microsoft.com/office/word/2006/wordml" xmlns:wps="http://schemas.microsoft.com/office/word/2010/wordprocessingShape" mc:Ignorable="w14 w15 w16se w16cid w16 w16cex w16sdtdh w16sdtfl w16du wp14">
-  <w16cid:commentId w16cid:paraId="4B4057B0" w16cid:durableId="2587178C"/>
+  <w16cid:commentId w16cid:paraId="07D76BD9" w16cid:durableId="20AD15F7"/>
 </w16cid:commentsIds>
 </file>
 

</xml_diff>